<commit_message>
Add :vmerge mark to vertically merge table cells across multiplied rows
</commit_message>
<xml_diff>
--- a/test-data/user.template-with-images.docx
+++ b/test-data/user.template-with-images.docx
@@ -1,10 +1,10 @@
 
 <file path=word/document.xml><?xml version="1.0" encoding="utf-8"?>
-<w:document xmlns:wpc="http://schemas.microsoft.com/office/word/2010/wordprocessingCanvas" xmlns:mc="http://schemas.openxmlformats.org/markup-compatibility/2006" xmlns:o="urn:schemas-microsoft-com:office:office" xmlns:r="http://schemas.openxmlformats.org/officeDocument/2006/relationships" xmlns:m="http://schemas.openxmlformats.org/officeDocument/2006/math" xmlns:v="urn:schemas-microsoft-com:vml" xmlns:wp14="http://schemas.microsoft.com/office/word/2010/wordprocessingDrawing" xmlns:wp="http://schemas.openxmlformats.org/drawingml/2006/wordprocessingDrawing" xmlns:w="http://schemas.openxmlformats.org/wordprocessingml/2006/main" xmlns:w14="http://schemas.microsoft.com/office/word/2010/wordml" xmlns:w10="urn:schemas-microsoft-com:office:word" xmlns:w15="http://schemas.microsoft.com/office/word/2012/wordml" xmlns:wpg="http://schemas.microsoft.com/office/word/2010/wordprocessingGroup" xmlns:wpi="http://schemas.microsoft.com/office/word/2010/wordprocessingInk" xmlns:wne="http://schemas.microsoft.com/office/word/2006/wordml" xmlns:wps="http://schemas.microsoft.com/office/word/2010/wordprocessingShape" xmlns:wpsCustomData="http://www.wps.cn/officeDocument/2013/wpsCustomData" mc:Ignorable="w14 w15 wp14">
+<w:document xmlns:wpc="http://schemas.microsoft.com/office/word/2010/wordprocessingCanvas" xmlns:cx="http://schemas.microsoft.com/office/drawing/2014/chartex" xmlns:cx1="http://schemas.microsoft.com/office/drawing/2015/9/8/chartex" xmlns:cx2="http://schemas.microsoft.com/office/drawing/2015/10/21/chartex" xmlns:cx3="http://schemas.microsoft.com/office/drawing/2016/5/9/chartex" xmlns:cx4="http://schemas.microsoft.com/office/drawing/2016/5/10/chartex" xmlns:cx5="http://schemas.microsoft.com/office/drawing/2016/5/11/chartex" xmlns:cx6="http://schemas.microsoft.com/office/drawing/2016/5/12/chartex" xmlns:cx7="http://schemas.microsoft.com/office/drawing/2016/5/13/chartex" xmlns:cx8="http://schemas.microsoft.com/office/drawing/2016/5/14/chartex" xmlns:mc="http://schemas.openxmlformats.org/markup-compatibility/2006" xmlns:o="urn:schemas-microsoft-com:office:office" xmlns:r="http://schemas.openxmlformats.org/officeDocument/2006/relationships" xmlns:m="http://schemas.openxmlformats.org/officeDocument/2006/math" xmlns:v="urn:schemas-microsoft-com:vml" xmlns:wp14="http://schemas.microsoft.com/office/word/2010/wordprocessingDrawing" xmlns:wp="http://schemas.openxmlformats.org/drawingml/2006/wordprocessingDrawing" xmlns:w="http://schemas.openxmlformats.org/wordprocessingml/2006/main" xmlns:w14="http://schemas.microsoft.com/office/word/2010/wordml" xmlns:w10="urn:schemas-microsoft-com:office:word" xmlns:w15="http://schemas.microsoft.com/office/word/2012/wordml" xmlns:wpg="http://schemas.microsoft.com/office/word/2010/wordprocessingGroup" xmlns:wpi="http://schemas.microsoft.com/office/word/2010/wordprocessingInk" xmlns:wne="http://schemas.microsoft.com/office/word/2006/wordml" xmlns:wps="http://schemas.microsoft.com/office/word/2010/wordprocessingShape" xmlns:wpsCustomData="http://www.wps.cn/officeDocument/2013/wpsCustomData" mc:Ignorable="w14 w15 wp14">
   <w:body>
     <w:p>
       <w:pPr>
-        <w:pStyle w:val="9"/>
+        <w:pStyle w:val="7"/>
         <w:spacing w:before="240" w:after="120"/>
         <w:jc w:val="center"/>
       </w:pPr>
@@ -14,7 +14,7 @@
     </w:p>
     <w:p>
       <w:pPr>
-        <w:pStyle w:val="7"/>
+        <w:pStyle w:val="4"/>
         <w:rPr>
           <w:color w:val="999999"/>
         </w:rPr>
@@ -42,7 +42,7 @@
     </w:p>
     <w:p>
       <w:pPr>
-        <w:pStyle w:val="7"/>
+        <w:pStyle w:val="4"/>
         <w:rPr>
           <w:rFonts w:hint="default"/>
           <w:color w:val="000000" w:themeColor="text1"/>
@@ -624,7 +624,7 @@
     </w:p>
     <w:tbl>
       <w:tblPr>
-        <w:tblStyle w:val="3"/>
+        <w:tblStyle w:val="8"/>
         <w:tblW w:w="9733" w:type="dxa"/>
         <w:tblInd w:w="0" w:type="dxa"/>
         <w:tblBorders>
@@ -844,29 +844,7 @@
                 <w:sz w:val="30"/>
                 <w:szCs w:val="30"/>
               </w:rPr>
-              <w:t>cl</w:t>
-            </w:r>
-            <w:r>
-              <w:rPr>
-                <w:rFonts w:hint="default"/>
-                <w:b/>
-                <w:bCs/>
-                <w:sz w:val="30"/>
-                <w:szCs w:val="30"/>
-              </w:rPr>
-              <w:t>e</w:t>
-            </w:r>
-            <w:bookmarkStart w:id="0" w:name="_GoBack"/>
-            <w:bookmarkEnd w:id="0"/>
-            <w:r>
-              <w:rPr>
-                <w:rFonts w:hint="default"/>
-                <w:b/>
-                <w:bCs/>
-                <w:sz w:val="30"/>
-                <w:szCs w:val="30"/>
-              </w:rPr>
-              <w:t>ar</w:t>
+              <w:t>clear</w:t>
             </w:r>
             <w:r>
               <w:rPr>
@@ -986,7 +964,27 @@
                 <w:sz w:val="30"/>
                 <w:szCs w:val="30"/>
               </w:rPr>
-              <w:t>is friend to {{Name}}</w:t>
+              <w:t>is friend to {{Name</w:t>
+            </w:r>
+            <w:r>
+              <w:rPr>
+                <w:rFonts w:hint="eastAsia"/>
+                <w:color w:val="808080"/>
+                <w:sz w:val="30"/>
+                <w:szCs w:val="30"/>
+                <w:lang w:val="en-US" w:eastAsia="zh-CN"/>
+              </w:rPr>
+              <w:t xml:space="preserve"> :vmerge</w:t>
+            </w:r>
+            <w:bookmarkStart w:id="0" w:name="_GoBack"/>
+            <w:bookmarkEnd w:id="0"/>
+            <w:r>
+              <w:rPr>
+                <w:color w:val="808080"/>
+                <w:sz w:val="30"/>
+                <w:szCs w:val="30"/>
+              </w:rPr>
+              <w:t>}}</w:t>
             </w:r>
           </w:p>
         </w:tc>
@@ -1104,7 +1102,7 @@
           </mc:Choice>
           <mc:Fallback>
             <w:pict>
-              <v:shape id="Shape1" o:spid="_x0000_s1026" o:spt="100" style="position:absolute;left:0pt;margin-left:485.25pt;margin-top:15.75pt;height:19.2pt;width:19.2pt;z-index:251659264;mso-width-relative:page;mso-height-relative:page;" fillcolor="#729FCF" filled="t" stroked="t" coordsize="21600,21600" o:gfxdata="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" path="m10797,0l8278,8256,0,8256,6722,13405,4198,21600,10797,16580,17401,21600,14878,13405,21600,8256,13321,8256,10797,0xe">
+              <v:shape id="Shape1" o:spid="_x0000_s1026" o:spt="100" style="position:absolute;left:0pt;margin-left:485.25pt;margin-top:15.75pt;height:19.2pt;width:19.2pt;z-index:251659264;mso-width-relative:page;mso-height-relative:page;" fillcolor="#729FCF" filled="t" stroked="t" coordsize="21600,21600" o:gfxdata="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" path="m10797,0l8278,8256,0,8256,6722,13405,4198,21600,10797,16580,17401,21600,14878,13405,21600,8256,13321,8256,10797,0xe">
                 <v:fill on="t" focussize="0,0"/>
                 <v:stroke color="#3465A4" joinstyle="round"/>
                 <v:imagedata o:title=""/>
@@ -1661,13 +1659,13 @@
       <w:lang w:val="en-US" w:eastAsia="zh-CN" w:bidi="hi-IN"/>
     </w:rPr>
   </w:style>
-  <w:style w:type="character" w:default="1" w:styleId="2">
+  <w:style w:type="character" w:default="1" w:styleId="9">
     <w:name w:val="Default Paragraph Font"/>
     <w:semiHidden/>
     <w:qFormat/>
     <w:uiPriority w:val="0"/>
   </w:style>
-  <w:style w:type="table" w:default="1" w:styleId="3">
+  <w:style w:type="table" w:default="1" w:styleId="8">
     <w:name w:val="Normal Table"/>
     <w:semiHidden/>
     <w:qFormat/>
@@ -1681,16 +1679,7 @@
       </w:tblCellMar>
     </w:tblPr>
   </w:style>
-  <w:style w:type="paragraph" w:styleId="4">
-    <w:name w:val="Body Text"/>
-    <w:basedOn w:val="1"/>
-    <w:qFormat/>
-    <w:uiPriority w:val="0"/>
-    <w:pPr>
-      <w:spacing w:before="0" w:after="140" w:line="288" w:lineRule="auto"/>
-    </w:pPr>
-  </w:style>
-  <w:style w:type="paragraph" w:styleId="5">
+  <w:style w:type="paragraph" w:styleId="2">
     <w:name w:val="caption"/>
     <w:basedOn w:val="1"/>
     <w:next w:val="1"/>
@@ -1708,18 +1697,18 @@
       <w:szCs w:val="24"/>
     </w:rPr>
   </w:style>
-  <w:style w:type="paragraph" w:styleId="6">
-    <w:name w:val="List"/>
-    <w:basedOn w:val="4"/>
-    <w:qFormat/>
-    <w:uiPriority w:val="0"/>
-    <w:rPr>
-      <w:rFonts w:cs="Lohit Devanagari"/>
-    </w:rPr>
-  </w:style>
-  <w:style w:type="paragraph" w:styleId="7">
+  <w:style w:type="paragraph" w:styleId="3">
+    <w:name w:val="Body Text"/>
+    <w:basedOn w:val="1"/>
+    <w:qFormat/>
+    <w:uiPriority w:val="0"/>
+    <w:pPr>
+      <w:spacing w:before="0" w:after="140" w:line="288" w:lineRule="auto"/>
+    </w:pPr>
+  </w:style>
+  <w:style w:type="paragraph" w:styleId="4">
     <w:name w:val="Subtitle"/>
-    <w:basedOn w:val="8"/>
+    <w:basedOn w:val="5"/>
     <w:qFormat/>
     <w:uiPriority w:val="0"/>
     <w:pPr>
@@ -1731,10 +1720,10 @@
       <w:szCs w:val="36"/>
     </w:rPr>
   </w:style>
-  <w:style w:type="paragraph" w:customStyle="1" w:styleId="8">
+  <w:style w:type="paragraph" w:customStyle="1" w:styleId="5">
     <w:name w:val="Heading"/>
     <w:basedOn w:val="1"/>
-    <w:next w:val="4"/>
+    <w:next w:val="3"/>
     <w:qFormat/>
     <w:uiPriority w:val="0"/>
     <w:pPr>
@@ -1747,9 +1736,18 @@
       <w:szCs w:val="28"/>
     </w:rPr>
   </w:style>
-  <w:style w:type="paragraph" w:styleId="9">
+  <w:style w:type="paragraph" w:styleId="6">
+    <w:name w:val="List"/>
+    <w:basedOn w:val="3"/>
+    <w:qFormat/>
+    <w:uiPriority w:val="0"/>
+    <w:rPr>
+      <w:rFonts w:cs="Lohit Devanagari"/>
+    </w:rPr>
+  </w:style>
+  <w:style w:type="paragraph" w:styleId="7">
     <w:name w:val="Title"/>
-    <w:basedOn w:val="8"/>
+    <w:basedOn w:val="5"/>
     <w:qFormat/>
     <w:uiPriority w:val="0"/>
     <w:pPr>
@@ -4927,9 +4925,7 @@
 
 <file path=customXml/item1.xml><?xml version="1.0" encoding="utf-8"?>
 <s:customData xmlns="http://www.wps.cn/officeDocument/2013/wpsCustomData" xmlns:s="http://www.wps.cn/officeDocument/2013/wpsCustomData">
-  <customSectProps>
-    <customSectPr/>
-  </customSectProps>
+  <customSectProps/>
   <customShpExts>
     <customShpInfo spid="_x0000_s1026" textRotate="1"/>
   </customShpExts>

</xml_diff>